<commit_message>
Presentation: real-time war, battle with the enemy army, historical states
22 slides with fresh war-time screenshots and clips from the current
build: a new «Battle and the enemy army» slide (heroines firing, the
Wehrmacht with a tank and its strength), «Historical states» (the 1942
USSR map and states by year), six novelty cards, updated conclusions;
the speech text follows the new slides.

Co-Authored-By: Claude Opus 5.5 <noreply@anthropic.com>
Claude-Session: https://claude.ai/code/session_016dNneVQPenL5hrAc68BhMr
</commit_message>
<xml_diff>
--- a/belarus-game/docs/Текст выступления.docx
+++ b/belarus-game/docs/Текст выступления.docx
@@ -81,7 +81,7 @@
           <w:sz w:val="26"/>
           <w:szCs w:val="26"/>
         </w:rPr>
-        <w:t xml:space="preserve">Выступление рассчитано примерно на 7–8 минут: 20 слайдов, по 20–30 секунд на слайд.</w:t>
+        <w:t xml:space="preserve">Выступление рассчитано примерно на 8–9 минут: 22 слайда, по 20–30 секунд на слайд.</w:t>
       </w:r>
     </w:p>
     <w:p>
@@ -484,22 +484,22 @@
           <w:sz w:val="22"/>
           <w:szCs w:val="22"/>
         </w:rPr>
-        <w:t xml:space="preserve">На экране: Четыре карточки: армии, женщины, ракета, фигурки.</w:t>
-      </w:r>
-    </w:p>
-    <w:p>
-      <w:pPr>
-        <w:spacing w:after="120" w:line="300"/>
-        <w:ind w:firstLine="567"/>
-        <w:jc w:val="both"/>
-      </w:pPr>
-      <w:r>
-        <w:rPr>
-          <w:rFonts w:ascii="Times New Roman" w:cs="Times New Roman" w:eastAsia="Times New Roman" w:hAnsi="Times New Roman"/>
-          <w:sz w:val="28"/>
-          <w:szCs w:val="28"/>
-        </w:rPr>
-        <w:t xml:space="preserve">Что нового в моей игре? Во-первых, армиями можно управлять на трёхмерной карте, как в известной стратегии Hearts of Iron. Во-вторых, в игре 17 женщин из истории Беларуси — от Франтишки Уршули Радзивилл до Марины Василевской. В-третьих, есть анимация взлёта ракеты с белорусскими космонавтами. И все фигурки войск в игре — женщины-героини.</w:t>
+        <w:t xml:space="preserve">На экране: Шесть карточек появляются по очереди.</w:t>
+      </w:r>
+    </w:p>
+    <w:p>
+      <w:pPr>
+        <w:spacing w:after="120" w:line="300"/>
+        <w:ind w:firstLine="567"/>
+        <w:jc w:val="both"/>
+      </w:pPr>
+      <w:r>
+        <w:rPr>
+          <w:rFonts w:ascii="Times New Roman" w:cs="Times New Roman" w:eastAsia="Times New Roman" w:hAnsi="Times New Roman"/>
+          <w:sz w:val="28"/>
+          <w:szCs w:val="28"/>
+        </w:rPr>
+        <w:t xml:space="preserve">Что нового в моей игре? Во-первых, война идёт как в известной стратегии Hearts of Iron: армии сами идут по трёхмерной карте и сражаются прямо в реальном времени, а армию врага видно. Во-вторых, на карте показаны исторические государства: Великое Княжество Литовское, Речь Посполитая, Российская империя, СССР. В-третьих, в игре 17 женщин из истории Беларуси — от Франтишки Уршули Радзивилл до Марины Василевской. Есть анимация взлёта ракеты с белорусскими космонавтами. Все войска в игре — женщины-героини. А с 1984 года игрок сам строит метро в Минске.</w:t>
       </w:r>
     </w:p>
     <w:p>
@@ -605,7 +605,7 @@
           <w:sz w:val="28"/>
           <w:szCs w:val="28"/>
         </w:rPr>
-        <w:t xml:space="preserve">Каждый ход охватывает несколько лет. За ход игрок изучает технологии, строит, приглашает деятелей и решает исторические события. Например, в 1943 году игра спрашивает, проводить ли операцию «Возмездие». От выбора зависят ресурсы, население и оборона. Когда всё сделано, игрок нажимает «Завершить ход».</w:t>
+        <w:t xml:space="preserve">Каждый ход охватывает несколько лет. За ход игрок изучает технологии, строит, приглашает деятелей и решает исторические события. Например, в 1943 году игра спрашивает, проводить ли операцию «Возмездие». От выбора зависят ресурсы, население и оборона. Когда всё сделано, игрок нажимает «Завершить ход». А война идёт сама, прямо в реальном времени.</w:t>
       </w:r>
     </w:p>
     <w:p>
@@ -643,43 +643,96 @@
           <w:sz w:val="22"/>
           <w:szCs w:val="22"/>
         </w:rPr>
-        <w:t xml:space="preserve">На экране: Кадр фронта 1943 года и анимация: стреляют пушки.</w:t>
-      </w:r>
-    </w:p>
-    <w:p>
-      <w:pPr>
-        <w:spacing w:after="120" w:line="300"/>
-        <w:ind w:firstLine="567"/>
-        <w:jc w:val="both"/>
-      </w:pPr>
-      <w:r>
-        <w:rPr>
-          <w:rFonts w:ascii="Times New Roman" w:cs="Times New Roman" w:eastAsia="Times New Roman" w:hAnsi="Times New Roman"/>
-          <w:sz w:val="28"/>
-          <w:szCs w:val="28"/>
-        </w:rPr>
-        <w:t xml:space="preserve">Войной игрок управляет сам, как в стратегии Hearts of Iron. Нужно нажать на фигурку армии, а потом на город или землю — и армия пойдёт туда. Бой начинается, когда армия дошла до цели. На анимации видно, как стреляют пушки. Армии можно делить и объединять.</w:t>
-      </w:r>
-    </w:p>
-    <w:p>
-      <w:pPr>
-        <w:pStyle w:val="Heading2"/>
-        <w:keepNext/>
-        <w:pBdr>
-          <w:bottom w:val="single" w:color="C8102E" w:sz="6" w:space="2"/>
-        </w:pBdr>
-        <w:spacing w:after="60" w:before="240"/>
-      </w:pPr>
-      <w:r>
-        <w:rPr>
-          <w:rFonts w:ascii="Times New Roman" w:cs="Times New Roman" w:eastAsia="Times New Roman" w:hAnsi="Times New Roman"/>
-          <w:b/>
-          <w:bCs/>
-          <w:color w:val="1B1F1D"/>
-          <w:sz w:val="28"/>
-          <w:szCs w:val="28"/>
-        </w:rPr>
-        <w:t xml:space="preserve">Слайд 10. Снабжение и железные дороги</w:t>
+        <w:t xml:space="preserve">На экране: Кадр фронта 1943 года и анимация: отряд идёт на Могилёв.</w:t>
+      </w:r>
+    </w:p>
+    <w:p>
+      <w:pPr>
+        <w:spacing w:after="120" w:line="300"/>
+        <w:ind w:firstLine="567"/>
+        <w:jc w:val="both"/>
+      </w:pPr>
+      <w:r>
+        <w:rPr>
+          <w:rFonts w:ascii="Times New Roman" w:cs="Times New Roman" w:eastAsia="Times New Roman" w:hAnsi="Times New Roman"/>
+          <w:sz w:val="28"/>
+          <w:szCs w:val="28"/>
+        </w:rPr>
+        <w:t xml:space="preserve">Война идёт в реальном времени, как в стратегии Hearts of Iron. Когда игрок объявляет поход или освобождение, армия сама идёт к цели — одна клетка за 10 секунд. Можно командовать и самому: нажать на отряд, а потом на город. Когда армия дошла до цели, раз в 10 секунд идёт бой.</w:t>
+      </w:r>
+    </w:p>
+    <w:p>
+      <w:pPr>
+        <w:pStyle w:val="Heading2"/>
+        <w:keepNext/>
+        <w:pBdr>
+          <w:bottom w:val="single" w:color="C8102E" w:sz="6" w:space="2"/>
+        </w:pBdr>
+        <w:spacing w:after="60" w:before="240"/>
+      </w:pPr>
+      <w:r>
+        <w:rPr>
+          <w:rFonts w:ascii="Times New Roman" w:cs="Times New Roman" w:eastAsia="Times New Roman" w:hAnsi="Times New Roman"/>
+          <w:b/>
+          <w:bCs/>
+          <w:color w:val="1B1F1D"/>
+          <w:sz w:val="28"/>
+          <w:szCs w:val="28"/>
+        </w:rPr>
+        <w:t xml:space="preserve">Слайд 10. Бой и армия врага</w:t>
+      </w:r>
+    </w:p>
+    <w:p>
+      <w:pPr>
+        <w:keepNext/>
+        <w:spacing w:after="80"/>
+      </w:pPr>
+      <w:r>
+        <w:rPr>
+          <w:rFonts w:ascii="Times New Roman" w:cs="Times New Roman" w:eastAsia="Times New Roman" w:hAnsi="Times New Roman"/>
+          <w:i/>
+          <w:iCs/>
+          <w:color w:val="6B7570"/>
+          <w:sz w:val="22"/>
+          <w:szCs w:val="22"/>
+        </w:rPr>
+        <w:t xml:space="preserve">На экране: Анимация боя за Могилёв в 1943 году.</w:t>
+      </w:r>
+    </w:p>
+    <w:p>
+      <w:pPr>
+        <w:spacing w:after="120" w:line="300"/>
+        <w:ind w:firstLine="567"/>
+        <w:jc w:val="both"/>
+      </w:pPr>
+      <w:r>
+        <w:rPr>
+          <w:rFonts w:ascii="Times New Roman" w:cs="Times New Roman" w:eastAsia="Times New Roman" w:hAnsi="Times New Roman"/>
+          <w:sz w:val="28"/>
+          <w:szCs w:val="28"/>
+        </w:rPr>
+        <w:t xml:space="preserve">Вот как выглядит бой. Наши героини стреляют — видны вспышки и дым. Напротив стоит армия врага: в 1943 году это вермахт с танком, и написана его сила. В оккупированных областях видны вражеские гарнизоны. Когда сила врага сломлена, область освобождена: доходы растут, и каратели больше не жгут деревни.</w:t>
+      </w:r>
+    </w:p>
+    <w:p>
+      <w:pPr>
+        <w:pStyle w:val="Heading2"/>
+        <w:keepNext/>
+        <w:pBdr>
+          <w:bottom w:val="single" w:color="C8102E" w:sz="6" w:space="2"/>
+        </w:pBdr>
+        <w:spacing w:after="60" w:before="240"/>
+      </w:pPr>
+      <w:r>
+        <w:rPr>
+          <w:rFonts w:ascii="Times New Roman" w:cs="Times New Roman" w:eastAsia="Times New Roman" w:hAnsi="Times New Roman"/>
+          <w:b/>
+          <w:bCs/>
+          <w:color w:val="1B1F1D"/>
+          <w:sz w:val="28"/>
+          <w:szCs w:val="28"/>
+        </w:rPr>
+        <w:t xml:space="preserve">Слайд 11. Снабжение и железные дороги</w:t>
       </w:r>
     </w:p>
     <w:p>
@@ -732,7 +785,7 @@
           <w:sz w:val="28"/>
           <w:szCs w:val="28"/>
         </w:rPr>
-        <w:t xml:space="preserve">Слайд 11. 3D-карта Беларуси</w:t>
+        <w:t xml:space="preserve">Слайд 12. 3D-карта Беларуси</w:t>
       </w:r>
     </w:p>
     <w:p>
@@ -785,7 +838,60 @@
           <w:sz w:val="28"/>
           <w:szCs w:val="28"/>
         </w:rPr>
-        <w:t xml:space="preserve">Слайд 12. Задания, летописец и итоги</w:t>
+        <w:t xml:space="preserve">Слайд 13. Исторические государства</w:t>
+      </w:r>
+    </w:p>
+    <w:p>
+      <w:pPr>
+        <w:keepNext/>
+        <w:spacing w:after="80"/>
+      </w:pPr>
+      <w:r>
+        <w:rPr>
+          <w:rFonts w:ascii="Times New Roman" w:cs="Times New Roman" w:eastAsia="Times New Roman" w:hAnsi="Times New Roman"/>
+          <w:i/>
+          <w:iCs/>
+          <w:color w:val="6B7570"/>
+          <w:sz w:val="22"/>
+          <w:szCs w:val="22"/>
+        </w:rPr>
+        <w:t xml:space="preserve">На экране: Карта 1942 года и список государств по годам.</w:t>
+      </w:r>
+    </w:p>
+    <w:p>
+      <w:pPr>
+        <w:spacing w:after="120" w:line="300"/>
+        <w:ind w:firstLine="567"/>
+        <w:jc w:val="both"/>
+      </w:pPr>
+      <w:r>
+        <w:rPr>
+          <w:rFonts w:ascii="Times New Roman" w:cs="Times New Roman" w:eastAsia="Times New Roman" w:hAnsi="Times New Roman"/>
+          <w:sz w:val="28"/>
+          <w:szCs w:val="28"/>
+        </w:rPr>
+        <w:t xml:space="preserve">На карте видна не только современная Беларусь, но и государства, в которые в разные века входили белорусские земли: Полоцкое и Туровское княжества, Великое Княжество Литовское, Речь Посполитая, Российская империя, СССР. Во время Великой Отечественной войны карта показывает СССР и соседние республики, а с 1991 года — Республику Беларусь.</w:t>
+      </w:r>
+    </w:p>
+    <w:p>
+      <w:pPr>
+        <w:pStyle w:val="Heading2"/>
+        <w:keepNext/>
+        <w:pBdr>
+          <w:bottom w:val="single" w:color="C8102E" w:sz="6" w:space="2"/>
+        </w:pBdr>
+        <w:spacing w:after="60" w:before="240"/>
+      </w:pPr>
+      <w:r>
+        <w:rPr>
+          <w:rFonts w:ascii="Times New Roman" w:cs="Times New Roman" w:eastAsia="Times New Roman" w:hAnsi="Times New Roman"/>
+          <w:b/>
+          <w:bCs/>
+          <w:color w:val="1B1F1D"/>
+          <w:sz w:val="28"/>
+          <w:szCs w:val="28"/>
+        </w:rPr>
+        <w:t xml:space="preserve">Слайд 14. Задания, летописец и итоги</w:t>
       </w:r>
     </w:p>
     <w:p>
@@ -838,7 +944,7 @@
           <w:sz w:val="28"/>
           <w:szCs w:val="28"/>
         </w:rPr>
-        <w:t xml:space="preserve">Слайд 13. Беларусь в годы войны</w:t>
+        <w:t xml:space="preserve">Слайд 15. Беларусь в годы войны</w:t>
       </w:r>
     </w:p>
     <w:p>
@@ -891,7 +997,7 @@
           <w:sz w:val="28"/>
           <w:szCs w:val="28"/>
         </w:rPr>
-        <w:t xml:space="preserve">Слайд 14. Операция «Возмездие», 1943</w:t>
+        <w:t xml:space="preserve">Слайд 16. Операция «Возмездие», 1943</w:t>
       </w:r>
     </w:p>
     <w:p>
@@ -944,7 +1050,7 @@
           <w:sz w:val="28"/>
           <w:szCs w:val="28"/>
         </w:rPr>
-        <w:t xml:space="preserve">Слайд 15. Героини войны в игре</w:t>
+        <w:t xml:space="preserve">Слайд 17. Героини войны в игре</w:t>
       </w:r>
     </w:p>
     <w:p>
@@ -997,60 +1103,60 @@
           <w:sz w:val="28"/>
           <w:szCs w:val="28"/>
         </w:rPr>
-        <w:t xml:space="preserve">Слайд 16. Освобождение и фигурки</w:t>
-      </w:r>
-    </w:p>
-    <w:p>
-      <w:pPr>
-        <w:keepNext/>
-        <w:spacing w:after="80"/>
-      </w:pPr>
-      <w:r>
-        <w:rPr>
-          <w:rFonts w:ascii="Times New Roman" w:cs="Times New Roman" w:eastAsia="Times New Roman" w:hAnsi="Times New Roman"/>
-          <w:i/>
-          <w:iCs/>
-          <w:color w:val="6B7570"/>
-          <w:sz w:val="22"/>
-          <w:szCs w:val="22"/>
-        </w:rPr>
-        <w:t xml:space="preserve">На экране: Вкладка «Армия» в 1943 году и анимация боя.</w:t>
-      </w:r>
-    </w:p>
-    <w:p>
-      <w:pPr>
-        <w:spacing w:after="120" w:line="300"/>
-        <w:ind w:firstLine="567"/>
-        <w:jc w:val="both"/>
-      </w:pPr>
-      <w:r>
-        <w:rPr>
-          <w:rFonts w:ascii="Times New Roman" w:cs="Times New Roman" w:eastAsia="Times New Roman" w:hAnsi="Times New Roman"/>
-          <w:sz w:val="28"/>
-          <w:szCs w:val="28"/>
-        </w:rPr>
-        <w:t xml:space="preserve">В 1943–1944 годах игрок сам освобождает области: ведёт армии к центрам областей, и у цели начинается бой. А все фигурки войск в игре — женщины-героини: стрелки, лётчицы, партизанки и танкистки.</w:t>
-      </w:r>
-    </w:p>
-    <w:p>
-      <w:pPr>
-        <w:pStyle w:val="Heading2"/>
-        <w:keepNext/>
-        <w:pBdr>
-          <w:bottom w:val="single" w:color="C8102E" w:sz="6" w:space="2"/>
-        </w:pBdr>
-        <w:spacing w:after="60" w:before="240"/>
-      </w:pPr>
-      <w:r>
-        <w:rPr>
-          <w:rFonts w:ascii="Times New Roman" w:cs="Times New Roman" w:eastAsia="Times New Roman" w:hAnsi="Times New Roman"/>
-          <w:b/>
-          <w:bCs/>
-          <w:color w:val="1B1F1D"/>
-          <w:sz w:val="28"/>
-          <w:szCs w:val="28"/>
-        </w:rPr>
-        <w:t xml:space="preserve">Слайд 17. Космос: взлёт ракеты</w:t>
+        <w:t xml:space="preserve">Слайд 18. Освобождение областей</w:t>
+      </w:r>
+    </w:p>
+    <w:p>
+      <w:pPr>
+        <w:keepNext/>
+        <w:spacing w:after="80"/>
+      </w:pPr>
+      <w:r>
+        <w:rPr>
+          <w:rFonts w:ascii="Times New Roman" w:cs="Times New Roman" w:eastAsia="Times New Roman" w:hAnsi="Times New Roman"/>
+          <w:i/>
+          <w:iCs/>
+          <w:color w:val="6B7570"/>
+          <w:sz w:val="22"/>
+          <w:szCs w:val="22"/>
+        </w:rPr>
+        <w:t xml:space="preserve">На экране: Вкладка «Армия» в 1943 году и бой у Могилёва.</w:t>
+      </w:r>
+    </w:p>
+    <w:p>
+      <w:pPr>
+        <w:spacing w:after="120" w:line="300"/>
+        <w:ind w:firstLine="567"/>
+        <w:jc w:val="both"/>
+      </w:pPr>
+      <w:r>
+        <w:rPr>
+          <w:rFonts w:ascii="Times New Roman" w:cs="Times New Roman" w:eastAsia="Times New Roman" w:hAnsi="Times New Roman"/>
+          <w:sz w:val="28"/>
+          <w:szCs w:val="28"/>
+        </w:rPr>
+        <w:t xml:space="preserve">В 1943–1944 годах игрок освобождает области: армии идут к центрам областей, и у цели начинается бой. А все войска в игре — женщины-героини: стрелки, лётчицы, партизанки и танкистки.</w:t>
+      </w:r>
+    </w:p>
+    <w:p>
+      <w:pPr>
+        <w:pStyle w:val="Heading2"/>
+        <w:keepNext/>
+        <w:pBdr>
+          <w:bottom w:val="single" w:color="C8102E" w:sz="6" w:space="2"/>
+        </w:pBdr>
+        <w:spacing w:after="60" w:before="240"/>
+      </w:pPr>
+      <w:r>
+        <w:rPr>
+          <w:rFonts w:ascii="Times New Roman" w:cs="Times New Roman" w:eastAsia="Times New Roman" w:hAnsi="Times New Roman"/>
+          <w:b/>
+          <w:bCs/>
+          <w:color w:val="1B1F1D"/>
+          <w:sz w:val="28"/>
+          <w:szCs w:val="28"/>
+        </w:rPr>
+        <w:t xml:space="preserve">Слайд 19. Космос: взлёт ракеты</w:t>
       </w:r>
     </w:p>
     <w:p>
@@ -1103,7 +1209,7 @@
           <w:sz w:val="28"/>
           <w:szCs w:val="28"/>
         </w:rPr>
-        <w:t xml:space="preserve">Слайд 18. Первая женщина-космонавт</w:t>
+        <w:t xml:space="preserve">Слайд 20. Первая женщина-космонавт</w:t>
       </w:r>
     </w:p>
     <w:p>
@@ -1156,7 +1262,7 @@
           <w:sz w:val="28"/>
           <w:szCs w:val="28"/>
         </w:rPr>
-        <w:t xml:space="preserve">Слайд 19. Результаты и выводы</w:t>
+        <w:t xml:space="preserve">Слайд 21. Результаты и выводы</w:t>
       </w:r>
     </w:p>
     <w:p>
@@ -1188,7 +1294,7 @@
           <w:sz w:val="28"/>
           <w:szCs w:val="28"/>
         </w:rPr>
-        <w:t xml:space="preserve">Подведу итоги. Игра создана и работает на любом компьютере с Windows. В ней девять веков истории, армии на трёхмерной карте, 17 женщин из истории Беларуси и анимации.</w:t>
+        <w:t xml:space="preserve">Подведу итоги. Игра создана и работает на любом компьютере с Windows. В ней девять веков истории, война в реальном времени с армиями на трёхмерной карте, исторические государства и метро Минска, 17 женщин из истории Беларуси и анимации.</w:t>
       </w:r>
     </w:p>
     <w:p>
@@ -1224,7 +1330,7 @@
           <w:sz w:val="28"/>
           <w:szCs w:val="28"/>
         </w:rPr>
-        <w:t xml:space="preserve">Слайд 20. Спасибо за внимание!</w:t>
+        <w:t xml:space="preserve">Слайд 22. Спасибо за внимание!</w:t>
       </w:r>
     </w:p>
     <w:p>
@@ -1476,7 +1582,7 @@
           <w:sz w:val="28"/>
           <w:szCs w:val="28"/>
         </w:rPr>
-        <w:t xml:space="preserve">Ответ: Исторические государства на карте — Великое Княжество Литовское, Речь Посполитую, СССР — и метро в Минске, которое игрок строит сам. Над этим я уже работаю.</w:t>
+        <w:t xml:space="preserve">Ответ: Хочу сделать армии из 3D-моделей с анимацией, перевести игру на белорусский язык и добавить больше событий из истории моего города.</w:t>
       </w:r>
     </w:p>
     <w:p>

</xml_diff>

<commit_message>
Presentation and speech: new 3D army from Blender
Fresh screenshots and animations with the new troops, a card of the
WWII troops (ours and the Wehrmacht) on the liberation slide, texts
about 24 animated kinds of troops; admin build embeds the new files.

Co-Authored-By: Claude Opus 5.5 <noreply@anthropic.com>
Claude-Session: https://claude.ai/code/session_016dNneVQPenL5hrAc68BhMr
</commit_message>
<xml_diff>
--- a/belarus-game/docs/Текст выступления.docx
+++ b/belarus-game/docs/Текст выступления.docx
@@ -378,7 +378,7 @@
           <w:sz w:val="28"/>
           <w:szCs w:val="28"/>
         </w:rPr>
-        <w:t xml:space="preserve">Чтобы достичь цели, я поставил пять задач. Первая — изучить историю Беларуси: я использовал школьный конспект, учебник и энциклопедии. Вторая — придумать правила игры: эпохи, ресурсы, события, войны и задания. Третья — создать 3D-модели в программе Blender: карту, постройки, портреты и фигурки. Четвёртая — написать саму программу на языке C. И пятая — проверить игру автоматическими тестами.</w:t>
+        <w:t xml:space="preserve">Чтобы достичь цели, я поставил пять задач. Первая — изучить историю Беларуси: я использовал школьный конспект, учебник и энциклопедии. Вторая — придумать правила игры: эпохи, ресурсы, события, войны и задания. Третья — создать 3D-модели в программе Blender: карту, постройки, портреты и войска. Четвёртая — написать саму программу на языке C. И пятая — проверить игру автоматическими тестами.</w:t>
       </w:r>
     </w:p>
     <w:p>
@@ -431,7 +431,7 @@
           <w:sz w:val="28"/>
           <w:szCs w:val="28"/>
         </w:rPr>
-        <w:t xml:space="preserve">Игра написана на языке программирования C с помощью Windows API. Это один файл: ему не нужны интернет и дополнительные программы. Трёхмерную графику карты я сделал сам, а модели построек, портреты и фигурки — в Blender. Специальный бот проходит всю игру от 1100 до 2026 года и проверяет, что всё работает.</w:t>
+        <w:t xml:space="preserve">Игра написана на языке программирования C с помощью Windows API. Это один файл: ему не нужны интернет и дополнительные программы. Трёхмерную графику карты я сделал сам, а модели построек, портреты и войска — в Blender. Специальный бот проходит всю игру от 1100 до 2026 года и проверяет, что всё работает.</w:t>
       </w:r>
     </w:p>
     <w:p>
@@ -711,7 +711,7 @@
           <w:sz w:val="28"/>
           <w:szCs w:val="28"/>
         </w:rPr>
-        <w:t xml:space="preserve">Вот как выглядит бой. Наши героини стреляют — видны вспышки и дым. Напротив стоит армия врага: в 1943 году это вермахт с танком, и написана его сила. В оккупированных областях видны вражеские гарнизоны. Когда сила врага сломлена, область освобождена: доходы растут, и каратели больше не жгут деревни.</w:t>
+        <w:t xml:space="preserve">Вот как выглядит бой. Войска — это 3D-модели, которые я сделал в Blender: героини шагают и стреляют, видны вспышки и дым. Напротив стоит армия врага: в 1943 году это вермахт с танком, и написана его сила. В оккупированных областях видны вражеские гарнизоны. Когда сила врага сломлена, область освобождена: доходы растут, и каратели больше не жгут деревни.</w:t>
       </w:r>
     </w:p>
     <w:p>
@@ -1120,22 +1120,22 @@
           <w:sz w:val="22"/>
           <w:szCs w:val="22"/>
         </w:rPr>
-        <w:t xml:space="preserve">На экране: Вкладка «Армия» в 1943 году и бой у Могилёва.</w:t>
-      </w:r>
-    </w:p>
-    <w:p>
-      <w:pPr>
-        <w:spacing w:after="120" w:line="300"/>
-        <w:ind w:firstLine="567"/>
-        <w:jc w:val="both"/>
-      </w:pPr>
-      <w:r>
-        <w:rPr>
-          <w:rFonts w:ascii="Times New Roman" w:cs="Times New Roman" w:eastAsia="Times New Roman" w:hAnsi="Times New Roman"/>
-          <w:sz w:val="28"/>
-          <w:szCs w:val="28"/>
-        </w:rPr>
-        <w:t xml:space="preserve">В 1943–1944 годах игрок освобождает области: армии идут к центрам областей, и у цели начинается бой. А все войска в игре — женщины-героини: стрелки, лётчицы, партизанки и танкистки.</w:t>
+        <w:t xml:space="preserve">На экране: Вкладка «Армия» в 1943 году и 3D-войска из Blender.</w:t>
+      </w:r>
+    </w:p>
+    <w:p>
+      <w:pPr>
+        <w:spacing w:after="120" w:line="300"/>
+        <w:ind w:firstLine="567"/>
+        <w:jc w:val="both"/>
+      </w:pPr>
+      <w:r>
+        <w:rPr>
+          <w:rFonts w:ascii="Times New Roman" w:cs="Times New Roman" w:eastAsia="Times New Roman" w:hAnsi="Times New Roman"/>
+          <w:sz w:val="28"/>
+          <w:szCs w:val="28"/>
+        </w:rPr>
+        <w:t xml:space="preserve">В 1943–1944 годах игрок освобождает области: армии идут к центрам областей, и у цели начинается бой. Все наши войска — женщины-героини: стрелки, партизанки, артиллеристки, танкистки и лётчицы. Это 3D-модели из Blender: 24 вида войск, и каждый шагает и стреляет.</w:t>
       </w:r>
     </w:p>
     <w:p>
@@ -1453,7 +1453,7 @@
           <w:sz w:val="28"/>
           <w:szCs w:val="28"/>
         </w:rPr>
-        <w:t xml:space="preserve">Вопрос: Почему все фигурки солдат — женщины?</w:t>
+        <w:t xml:space="preserve">Вопрос: Почему все наши солдаты в игре — женщины?</w:t>
       </w:r>
     </w:p>
     <w:p>

</xml_diff>

<commit_message>
Presentation: Berlin 1945 and iPhone slides, updated novelty and results
24 slides: a new «Штурм Берлина и Знамя Победы» slide with the flag
animation and the street battle, a «Версия для iPhone» slide with a
simulator screenshot in a phone frame, six sections in the contents,
animations (Berlin, rocket, Chernobyl) and the 36-station metro in
«Что нового», iPhone in the results; the speech and Q&A follow. The
admin build embeds the new files.

Co-Authored-By: Claude Opus 5.5 <noreply@anthropic.com>
Claude-Session: https://claude.ai/code/session_016dNneVQPenL5hrAc68BhMr
</commit_message>
<xml_diff>
--- a/belarus-game/docs/Текст выступления.docx
+++ b/belarus-game/docs/Текст выступления.docx
@@ -242,22 +242,22 @@
           <w:sz w:val="22"/>
           <w:szCs w:val="22"/>
         </w:rPr>
-        <w:t xml:space="preserve">На экране: Пять разделов; на каждый можно нажать.</w:t>
-      </w:r>
-    </w:p>
-    <w:p>
-      <w:pPr>
-        <w:spacing w:after="120" w:line="300"/>
-        <w:ind w:firstLine="567"/>
-        <w:jc w:val="both"/>
-      </w:pPr>
-      <w:r>
-        <w:rPr>
-          <w:rFonts w:ascii="Times New Roman" w:cs="Times New Roman" w:eastAsia="Times New Roman" w:hAnsi="Times New Roman"/>
-          <w:sz w:val="28"/>
-          <w:szCs w:val="28"/>
-        </w:rPr>
-        <w:t xml:space="preserve">Мой рассказ состоит из пяти частей: защита проекта, как играть, Великая Отечественная война в игре, космос и итоги. Содержание интерактивное: на каждый раздел можно нажать и сразу перейти к нему.</w:t>
+        <w:t xml:space="preserve">На экране: Шесть разделов; на каждый можно нажать.</w:t>
+      </w:r>
+    </w:p>
+    <w:p>
+      <w:pPr>
+        <w:spacing w:after="120" w:line="300"/>
+        <w:ind w:firstLine="567"/>
+        <w:jc w:val="both"/>
+      </w:pPr>
+      <w:r>
+        <w:rPr>
+          <w:rFonts w:ascii="Times New Roman" w:cs="Times New Roman" w:eastAsia="Times New Roman" w:hAnsi="Times New Roman"/>
+          <w:sz w:val="28"/>
+          <w:szCs w:val="28"/>
+        </w:rPr>
+        <w:t xml:space="preserve">Мой рассказ состоит из шести частей: защита проекта, как играть, Великая Отечественная война в игре, космос, версия для iPhone и итоги. Содержание интерактивное: на каждый раздел можно нажать и сразу перейти к нему.</w:t>
       </w:r>
     </w:p>
     <w:p>
@@ -431,7 +431,7 @@
           <w:sz w:val="28"/>
           <w:szCs w:val="28"/>
         </w:rPr>
-        <w:t xml:space="preserve">Игра написана на языке программирования C с помощью Windows API. Это один файл: ему не нужны интернет и дополнительные программы. Трёхмерную графику карты я сделал сам, а модели построек, портреты и войска — в Blender. Специальный бот проходит всю игру от 1100 до 2026 года и проверяет, что всё работает.</w:t>
+        <w:t xml:space="preserve">Игра написана на языке программирования C с помощью Windows API. Это один файл: ему не нужны интернет и дополнительные программы. Трёхмерную графику карты я сделал сам, а модели построек, портреты и войска — в Blender. Из того же кода собирается и приложение для iPhone. Специальный бот проходит всю игру от 1100 до 2026 года и проверяет, что всё работает.</w:t>
       </w:r>
     </w:p>
     <w:p>
@@ -499,7 +499,7 @@
           <w:sz w:val="28"/>
           <w:szCs w:val="28"/>
         </w:rPr>
-        <w:t xml:space="preserve">Что нового в моей игре? Во-первых, война идёт как в известной стратегии Hearts of Iron: армии сами идут по трёхмерной карте и сражаются прямо в реальном времени, а армию врага видно. Во-вторых, на карте показаны исторические государства: Великое Княжество Литовское, Речь Посполитая, Российская империя, СССР. В-третьих, в игре 17 женщин из истории Беларуси — от Франтишки Уршули Радзивилл до Марины Василевской. Есть анимация взлёта ракеты с белорусскими космонавтами. Все войска в игре — женщины-героини. А с 1984 года игрок сам строит метро в Минске.</w:t>
+        <w:t xml:space="preserve">Что нового в моей игре? Во-первых, война идёт как в известной стратегии Hearts of Iron: армии сами идут по трёхмерной карте и сражаются прямо в реальном времени, а армию врага видно. Во-вторых, на карте показаны исторические государства: Великое Княжество Литовское, Речь Посполитая, Российская империя, СССР. В-третьих, в игре 17 женщин из истории Беларуси — от Франтишки Уршули Радзивилл до Марины Василевской. Есть анимации: штурм Берлина и Знамя Победы над Рейхстагом, взлёт ракеты с белорусскими космонавтами и авария на Чернобыльской АЭС. Все войска в игре — женщины-героини. А с 1984 года игрок сам строит метро в Минске — все 36 станций, и названия у них белорусские, как на табличках в метро.</w:t>
       </w:r>
     </w:p>
     <w:p>
@@ -1156,7 +1156,75 @@
           <w:sz w:val="28"/>
           <w:szCs w:val="28"/>
         </w:rPr>
-        <w:t xml:space="preserve">Слайд 19. Космос: взлёт ракеты</w:t>
+        <w:t xml:space="preserve">Слайд 19. Штурм Берлина и Знамя Победы</w:t>
+      </w:r>
+    </w:p>
+    <w:p>
+      <w:pPr>
+        <w:keepNext/>
+        <w:spacing w:after="80"/>
+      </w:pPr>
+      <w:r>
+        <w:rPr>
+          <w:rFonts w:ascii="Times New Roman" w:cs="Times New Roman" w:eastAsia="Times New Roman" w:hAnsi="Times New Roman"/>
+          <w:i/>
+          <w:iCs/>
+          <w:color w:val="6B7570"/>
+          <w:sz w:val="22"/>
+          <w:szCs w:val="22"/>
+        </w:rPr>
+        <w:t xml:space="preserve">На экране: Анимация: знамя над Рейхстагом и салют; справа — бои на улицах Берлина.</w:t>
+      </w:r>
+    </w:p>
+    <w:p>
+      <w:pPr>
+        <w:spacing w:after="120" w:line="300"/>
+        <w:ind w:firstLine="567"/>
+        <w:jc w:val="both"/>
+      </w:pPr>
+      <w:r>
+        <w:rPr>
+          <w:rFonts w:ascii="Times New Roman" w:cs="Times New Roman" w:eastAsia="Times New Roman" w:hAnsi="Times New Roman"/>
+          <w:sz w:val="28"/>
+          <w:szCs w:val="28"/>
+        </w:rPr>
+        <w:t xml:space="preserve">В начале 1945 года в игре показан штурм Берлина. Сначала бои на улицах: залпы «катюш», наши танки и пехота теснят вермахт. Потом штурм Рейхстага, и в ночь на 1 мая над ним поднимают Знамя Победы. Его укрепили сержант Михаил Егоров и младший сержант Мелитон Кантария во главе с лейтенантом Алексеем Берестом.</w:t>
+      </w:r>
+    </w:p>
+    <w:p>
+      <w:pPr>
+        <w:spacing w:after="120" w:line="300"/>
+        <w:ind w:firstLine="567"/>
+        <w:jc w:val="both"/>
+      </w:pPr>
+      <w:r>
+        <w:rPr>
+          <w:rFonts w:ascii="Times New Roman" w:cs="Times New Roman" w:eastAsia="Times New Roman" w:hAnsi="Times New Roman"/>
+          <w:sz w:val="28"/>
+          <w:szCs w:val="28"/>
+        </w:rPr>
+        <w:t xml:space="preserve">Берлин брали 1-й Белорусский фронт маршала Жукова и 1-й Украинский фронт маршала Конева. Белорусскими фронты назывались потому, что летом 1944 года освобождали Беларусь. До Берлина дошли и женщины: санинструкторы, связистки, снайперы, а на перекрёстках города движением войск управляли девушки-регулировщицы.</w:t>
+      </w:r>
+    </w:p>
+    <w:p>
+      <w:pPr>
+        <w:pStyle w:val="Heading2"/>
+        <w:keepNext/>
+        <w:pBdr>
+          <w:bottom w:val="single" w:color="C8102E" w:sz="6" w:space="2"/>
+        </w:pBdr>
+        <w:spacing w:after="60" w:before="240"/>
+      </w:pPr>
+      <w:r>
+        <w:rPr>
+          <w:rFonts w:ascii="Times New Roman" w:cs="Times New Roman" w:eastAsia="Times New Roman" w:hAnsi="Times New Roman"/>
+          <w:b/>
+          <w:bCs/>
+          <w:color w:val="1B1F1D"/>
+          <w:sz w:val="28"/>
+          <w:szCs w:val="28"/>
+        </w:rPr>
+        <w:t xml:space="preserve">Слайд 20. Космос: взлёт ракеты</w:t>
       </w:r>
     </w:p>
     <w:p>
@@ -1209,7 +1277,7 @@
           <w:sz w:val="28"/>
           <w:szCs w:val="28"/>
         </w:rPr>
-        <w:t xml:space="preserve">Слайд 20. Первая женщина-космонавт</w:t>
+        <w:t xml:space="preserve">Слайд 21. Первая женщина-космонавт</w:t>
       </w:r>
     </w:p>
     <w:p>
@@ -1262,7 +1330,60 @@
           <w:sz w:val="28"/>
           <w:szCs w:val="28"/>
         </w:rPr>
-        <w:t xml:space="preserve">Слайд 21. Результаты и выводы</w:t>
+        <w:t xml:space="preserve">Слайд 22. Версия для iPhone</w:t>
+      </w:r>
+    </w:p>
+    <w:p>
+      <w:pPr>
+        <w:keepNext/>
+        <w:spacing w:after="80"/>
+      </w:pPr>
+      <w:r>
+        <w:rPr>
+          <w:rFonts w:ascii="Times New Roman" w:cs="Times New Roman" w:eastAsia="Times New Roman" w:hAnsi="Times New Roman"/>
+          <w:i/>
+          <w:iCs/>
+          <w:color w:val="6B7570"/>
+          <w:sz w:val="22"/>
+          <w:szCs w:val="22"/>
+        </w:rPr>
+        <w:t xml:space="preserve">На экране: Снимок игры в симуляторе iPhone и три особенности приложения.</w:t>
+      </w:r>
+    </w:p>
+    <w:p>
+      <w:pPr>
+        <w:spacing w:after="120" w:line="300"/>
+        <w:ind w:firstLine="567"/>
+        <w:jc w:val="both"/>
+      </w:pPr>
+      <w:r>
+        <w:rPr>
+          <w:rFonts w:ascii="Times New Roman" w:cs="Times New Roman" w:eastAsia="Times New Roman" w:hAnsi="Times New Roman"/>
+          <w:sz w:val="28"/>
+          <w:szCs w:val="28"/>
+        </w:rPr>
+        <w:t xml:space="preserve">Игру можно поставить и на iPhone. Это настоящее приложение, а не сайт: в нём тот же код на языке C, что и в версии для Windows, только окно и шрифты свои. Управление касаниями: касание — выбрать, долгое нажатие — приказ армии, палец двигает карту, щипок её приближает. Приложение собирается на компьютере Mac в GitHub, а на телефон ставится через SideStore или AltStore.</w:t>
+      </w:r>
+    </w:p>
+    <w:p>
+      <w:pPr>
+        <w:pStyle w:val="Heading2"/>
+        <w:keepNext/>
+        <w:pBdr>
+          <w:bottom w:val="single" w:color="C8102E" w:sz="6" w:space="2"/>
+        </w:pBdr>
+        <w:spacing w:after="60" w:before="240"/>
+      </w:pPr>
+      <w:r>
+        <w:rPr>
+          <w:rFonts w:ascii="Times New Roman" w:cs="Times New Roman" w:eastAsia="Times New Roman" w:hAnsi="Times New Roman"/>
+          <w:b/>
+          <w:bCs/>
+          <w:color w:val="1B1F1D"/>
+          <w:sz w:val="28"/>
+          <w:szCs w:val="28"/>
+        </w:rPr>
+        <w:t xml:space="preserve">Слайд 23. Результаты и выводы</w:t>
       </w:r>
     </w:p>
     <w:p>
@@ -1294,7 +1415,7 @@
           <w:sz w:val="28"/>
           <w:szCs w:val="28"/>
         </w:rPr>
-        <w:t xml:space="preserve">Подведу итоги. Игра создана и работает на любом компьютере с Windows. В ней девять веков истории, война в реальном времени с армиями на трёхмерной карте, исторические государства и метро Минска, 17 женщин из истории Беларуси и анимации.</w:t>
+        <w:t xml:space="preserve">Подведу итоги. Игра создана и работает на любом компьютере с Windows, а теперь и на iPhone. В ней девять веков истории, война в реальном времени с армиями на трёхмерной карте, исторические государства и метро Минска, 17 женщин из истории Беларуси и анимации: 3D-войска, штурм Берлина, взлёт ракеты и авария на ЧАЭС.</w:t>
       </w:r>
     </w:p>
     <w:p>
@@ -1330,7 +1451,7 @@
           <w:sz w:val="28"/>
           <w:szCs w:val="28"/>
         </w:rPr>
-        <w:t xml:space="preserve">Слайд 22. Спасибо за внимание!</w:t>
+        <w:t xml:space="preserve">Слайд 24. Спасибо за внимание!</w:t>
       </w:r>
     </w:p>
     <w:p>
@@ -1437,7 +1558,7 @@
           <w:sz w:val="28"/>
           <w:szCs w:val="28"/>
         </w:rPr>
-        <w:t xml:space="preserve">Ответ: На языке C, с помощью Windows API, без сторонних библиотек. 3D-модели сделаны в программе Blender.</w:t>
+        <w:t xml:space="preserve">Ответ: На языке C, с помощью Windows API, без сторонних библиотек. 3D-модели сделаны в программе Blender. Для iPhone я сделал свою прослойку вместо Windows — остальной код тот же.</w:t>
       </w:r>
     </w:p>
     <w:p>
@@ -1453,6 +1574,35 @@
           <w:sz w:val="28"/>
           <w:szCs w:val="28"/>
         </w:rPr>
+        <w:t xml:space="preserve">Вопрос: Как поставить игру на iPhone?</w:t>
+      </w:r>
+    </w:p>
+    <w:p>
+      <w:pPr>
+        <w:spacing w:after="120" w:line="300"/>
+      </w:pPr>
+      <w:r>
+        <w:rPr>
+          <w:rFonts w:ascii="Times New Roman" w:cs="Times New Roman" w:eastAsia="Times New Roman" w:hAnsi="Times New Roman"/>
+          <w:sz w:val="28"/>
+          <w:szCs w:val="28"/>
+        </w:rPr>
+        <w:t xml:space="preserve">Ответ: Это файл .ipa. Его ставят через SideStore или AltStore: выбираешь файл в приложении «Файлы», и игра устанавливается. Нужен обычный Apple ID.</w:t>
+      </w:r>
+    </w:p>
+    <w:p>
+      <w:pPr>
+        <w:keepNext/>
+        <w:spacing w:after="40" w:before="160"/>
+      </w:pPr>
+      <w:r>
+        <w:rPr>
+          <w:rFonts w:ascii="Times New Roman" w:cs="Times New Roman" w:eastAsia="Times New Roman" w:hAnsi="Times New Roman"/>
+          <w:b/>
+          <w:bCs/>
+          <w:sz w:val="28"/>
+          <w:szCs w:val="28"/>
+        </w:rPr>
         <w:t xml:space="preserve">Вопрос: Почему все наши солдаты в игре — женщины?</w:t>
       </w:r>
     </w:p>
@@ -1582,7 +1732,7 @@
           <w:sz w:val="28"/>
           <w:szCs w:val="28"/>
         </w:rPr>
-        <w:t xml:space="preserve">Ответ: Хочу сделать армии из 3D-моделей с анимацией, перевести игру на белорусский язык и добавить больше событий из истории моего города.</w:t>
+        <w:t xml:space="preserve">Ответ: Хочу перевести игру на белорусский язык, выпустить её в App Store и добавить больше событий из истории моего города.</w:t>
       </w:r>
     </w:p>
     <w:p>

</xml_diff>

<commit_message>
Presentation: remove the iPhone slide and mentions
Back to 23 slides and five sections in the contents; the speech and
Q&A no longer mention the iPhone version. The Berlin slide stays.

Co-Authored-By: Claude Opus 5.5 <noreply@anthropic.com>
Claude-Session: https://claude.ai/code/session_016dNneVQPenL5hrAc68BhMr
</commit_message>
<xml_diff>
--- a/belarus-game/docs/Текст выступления.docx
+++ b/belarus-game/docs/Текст выступления.docx
@@ -242,22 +242,22 @@
           <w:sz w:val="22"/>
           <w:szCs w:val="22"/>
         </w:rPr>
-        <w:t xml:space="preserve">На экране: Шесть разделов; на каждый можно нажать.</w:t>
-      </w:r>
-    </w:p>
-    <w:p>
-      <w:pPr>
-        <w:spacing w:after="120" w:line="300"/>
-        <w:ind w:firstLine="567"/>
-        <w:jc w:val="both"/>
-      </w:pPr>
-      <w:r>
-        <w:rPr>
-          <w:rFonts w:ascii="Times New Roman" w:cs="Times New Roman" w:eastAsia="Times New Roman" w:hAnsi="Times New Roman"/>
-          <w:sz w:val="28"/>
-          <w:szCs w:val="28"/>
-        </w:rPr>
-        <w:t xml:space="preserve">Мой рассказ состоит из шести частей: защита проекта, как играть, Великая Отечественная война в игре, космос, версия для iPhone и итоги. Содержание интерактивное: на каждый раздел можно нажать и сразу перейти к нему.</w:t>
+        <w:t xml:space="preserve">На экране: Пять разделов; на каждый можно нажать.</w:t>
+      </w:r>
+    </w:p>
+    <w:p>
+      <w:pPr>
+        <w:spacing w:after="120" w:line="300"/>
+        <w:ind w:firstLine="567"/>
+        <w:jc w:val="both"/>
+      </w:pPr>
+      <w:r>
+        <w:rPr>
+          <w:rFonts w:ascii="Times New Roman" w:cs="Times New Roman" w:eastAsia="Times New Roman" w:hAnsi="Times New Roman"/>
+          <w:sz w:val="28"/>
+          <w:szCs w:val="28"/>
+        </w:rPr>
+        <w:t xml:space="preserve">Мой рассказ состоит из пяти частей: защита проекта, как играть, Великая Отечественная война в игре, космос и итоги. Содержание интерактивное: на каждый раздел можно нажать и сразу перейти к нему.</w:t>
       </w:r>
     </w:p>
     <w:p>
@@ -431,7 +431,7 @@
           <w:sz w:val="28"/>
           <w:szCs w:val="28"/>
         </w:rPr>
-        <w:t xml:space="preserve">Игра написана на языке программирования C с помощью Windows API. Это один файл: ему не нужны интернет и дополнительные программы. Трёхмерную графику карты я сделал сам, а модели построек, портреты и войска — в Blender. Из того же кода собирается и приложение для iPhone. Специальный бот проходит всю игру от 1100 до 2026 года и проверяет, что всё работает.</w:t>
+        <w:t xml:space="preserve">Игра написана на языке программирования C с помощью Windows API. Это один файл: ему не нужны интернет и дополнительные программы. Трёхмерную графику карты я сделал сам, а модели построек, портреты и войска — в Blender. Специальный бот проходит всю игру от 1100 до 2026 года и проверяет, что всё работает.</w:t>
       </w:r>
     </w:p>
     <w:p>
@@ -1330,60 +1330,7 @@
           <w:sz w:val="28"/>
           <w:szCs w:val="28"/>
         </w:rPr>
-        <w:t xml:space="preserve">Слайд 22. Версия для iPhone</w:t>
-      </w:r>
-    </w:p>
-    <w:p>
-      <w:pPr>
-        <w:keepNext/>
-        <w:spacing w:after="80"/>
-      </w:pPr>
-      <w:r>
-        <w:rPr>
-          <w:rFonts w:ascii="Times New Roman" w:cs="Times New Roman" w:eastAsia="Times New Roman" w:hAnsi="Times New Roman"/>
-          <w:i/>
-          <w:iCs/>
-          <w:color w:val="6B7570"/>
-          <w:sz w:val="22"/>
-          <w:szCs w:val="22"/>
-        </w:rPr>
-        <w:t xml:space="preserve">На экране: Снимок игры в симуляторе iPhone и три особенности приложения.</w:t>
-      </w:r>
-    </w:p>
-    <w:p>
-      <w:pPr>
-        <w:spacing w:after="120" w:line="300"/>
-        <w:ind w:firstLine="567"/>
-        <w:jc w:val="both"/>
-      </w:pPr>
-      <w:r>
-        <w:rPr>
-          <w:rFonts w:ascii="Times New Roman" w:cs="Times New Roman" w:eastAsia="Times New Roman" w:hAnsi="Times New Roman"/>
-          <w:sz w:val="28"/>
-          <w:szCs w:val="28"/>
-        </w:rPr>
-        <w:t xml:space="preserve">Игру можно поставить и на iPhone. Это настоящее приложение, а не сайт: в нём тот же код на языке C, что и в версии для Windows, только окно и шрифты свои. Управление касаниями: касание — выбрать, долгое нажатие — приказ армии, палец двигает карту, щипок её приближает. Приложение собирается на компьютере Mac в GitHub, а на телефон ставится через SideStore или AltStore.</w:t>
-      </w:r>
-    </w:p>
-    <w:p>
-      <w:pPr>
-        <w:pStyle w:val="Heading2"/>
-        <w:keepNext/>
-        <w:pBdr>
-          <w:bottom w:val="single" w:color="C8102E" w:sz="6" w:space="2"/>
-        </w:pBdr>
-        <w:spacing w:after="60" w:before="240"/>
-      </w:pPr>
-      <w:r>
-        <w:rPr>
-          <w:rFonts w:ascii="Times New Roman" w:cs="Times New Roman" w:eastAsia="Times New Roman" w:hAnsi="Times New Roman"/>
-          <w:b/>
-          <w:bCs/>
-          <w:color w:val="1B1F1D"/>
-          <w:sz w:val="28"/>
-          <w:szCs w:val="28"/>
-        </w:rPr>
-        <w:t xml:space="preserve">Слайд 23. Результаты и выводы</w:t>
+        <w:t xml:space="preserve">Слайд 22. Результаты и выводы</w:t>
       </w:r>
     </w:p>
     <w:p>
@@ -1415,7 +1362,7 @@
           <w:sz w:val="28"/>
           <w:szCs w:val="28"/>
         </w:rPr>
-        <w:t xml:space="preserve">Подведу итоги. Игра создана и работает на любом компьютере с Windows, а теперь и на iPhone. В ней девять веков истории, война в реальном времени с армиями на трёхмерной карте, исторические государства и метро Минска, 17 женщин из истории Беларуси и анимации: 3D-войска, штурм Берлина, взлёт ракеты и авария на ЧАЭС.</w:t>
+        <w:t xml:space="preserve">Подведу итоги. Игра создана и работает на любом компьютере с Windows. В ней девять веков истории, война в реальном времени с армиями на трёхмерной карте, исторические государства и метро Минска, 17 женщин из истории Беларуси и анимации: 3D-войска, штурм Берлина, взлёт ракеты и авария на ЧАЭС.</w:t>
       </w:r>
     </w:p>
     <w:p>
@@ -1451,7 +1398,7 @@
           <w:sz w:val="28"/>
           <w:szCs w:val="28"/>
         </w:rPr>
-        <w:t xml:space="preserve">Слайд 24. Спасибо за внимание!</w:t>
+        <w:t xml:space="preserve">Слайд 23. Спасибо за внимание!</w:t>
       </w:r>
     </w:p>
     <w:p>
@@ -1558,7 +1505,7 @@
           <w:sz w:val="28"/>
           <w:szCs w:val="28"/>
         </w:rPr>
-        <w:t xml:space="preserve">Ответ: На языке C, с помощью Windows API, без сторонних библиотек. 3D-модели сделаны в программе Blender. Для iPhone я сделал свою прослойку вместо Windows — остальной код тот же.</w:t>
+        <w:t xml:space="preserve">Ответ: На языке C, с помощью Windows API, без сторонних библиотек. 3D-модели сделаны в программе Blender.</w:t>
       </w:r>
     </w:p>
     <w:p>
@@ -1574,20 +1521,20 @@
           <w:sz w:val="28"/>
           <w:szCs w:val="28"/>
         </w:rPr>
-        <w:t xml:space="preserve">Вопрос: Как поставить игру на iPhone?</w:t>
-      </w:r>
-    </w:p>
-    <w:p>
-      <w:pPr>
-        <w:spacing w:after="120" w:line="300"/>
-      </w:pPr>
-      <w:r>
-        <w:rPr>
-          <w:rFonts w:ascii="Times New Roman" w:cs="Times New Roman" w:eastAsia="Times New Roman" w:hAnsi="Times New Roman"/>
-          <w:sz w:val="28"/>
-          <w:szCs w:val="28"/>
-        </w:rPr>
-        <w:t xml:space="preserve">Ответ: Это файл .ipa. Его ставят через SideStore или AltStore: выбираешь файл в приложении «Файлы», и игра устанавливается. Нужен обычный Apple ID.</w:t>
+        <w:t xml:space="preserve">Вопрос: Почему все наши солдаты в игре — женщины?</w:t>
+      </w:r>
+    </w:p>
+    <w:p>
+      <w:pPr>
+        <w:spacing w:after="120" w:line="300"/>
+      </w:pPr>
+      <w:r>
+        <w:rPr>
+          <w:rFonts w:ascii="Times New Roman" w:cs="Times New Roman" w:eastAsia="Times New Roman" w:hAnsi="Times New Roman"/>
+          <w:sz w:val="28"/>
+          <w:szCs w:val="28"/>
+        </w:rPr>
+        <w:t xml:space="preserve">Ответ: Чтобы подчеркнуть подвиг женщин: в партизанских отрядах Беларуси сражались около 45 тысяч женщин, в подполье — около 25 тысяч.</w:t>
       </w:r>
     </w:p>
     <w:p>
@@ -1603,20 +1550,20 @@
           <w:sz w:val="28"/>
           <w:szCs w:val="28"/>
         </w:rPr>
-        <w:t xml:space="preserve">Вопрос: Почему все наши солдаты в игре — женщины?</w:t>
-      </w:r>
-    </w:p>
-    <w:p>
-      <w:pPr>
-        <w:spacing w:after="120" w:line="300"/>
-      </w:pPr>
-      <w:r>
-        <w:rPr>
-          <w:rFonts w:ascii="Times New Roman" w:cs="Times New Roman" w:eastAsia="Times New Roman" w:hAnsi="Times New Roman"/>
-          <w:sz w:val="28"/>
-          <w:szCs w:val="28"/>
-        </w:rPr>
-        <w:t xml:space="preserve">Ответ: Чтобы подчеркнуть подвиг женщин: в партизанских отрядах Беларуси сражались около 45 тысяч женщин, в подполье — около 25 тысяч.</w:t>
+        <w:t xml:space="preserve">Вопрос: Откуда ты брал исторические факты?</w:t>
+      </w:r>
+    </w:p>
+    <w:p>
+      <w:pPr>
+        <w:spacing w:after="120" w:line="300"/>
+      </w:pPr>
+      <w:r>
+        <w:rPr>
+          <w:rFonts w:ascii="Times New Roman" w:cs="Times New Roman" w:eastAsia="Times New Roman" w:hAnsi="Times New Roman"/>
+          <w:sz w:val="28"/>
+          <w:szCs w:val="28"/>
+        </w:rPr>
+        <w:t xml:space="preserve">Ответ: Из школьного конспекта по истории Беларуси, учебника и энциклопедий.</w:t>
       </w:r>
     </w:p>
     <w:p>
@@ -1632,20 +1579,20 @@
           <w:sz w:val="28"/>
           <w:szCs w:val="28"/>
         </w:rPr>
-        <w:t xml:space="preserve">Вопрос: Откуда ты брал исторические факты?</w:t>
-      </w:r>
-    </w:p>
-    <w:p>
-      <w:pPr>
-        <w:spacing w:after="120" w:line="300"/>
-      </w:pPr>
-      <w:r>
-        <w:rPr>
-          <w:rFonts w:ascii="Times New Roman" w:cs="Times New Roman" w:eastAsia="Times New Roman" w:hAnsi="Times New Roman"/>
-          <w:sz w:val="28"/>
-          <w:szCs w:val="28"/>
-        </w:rPr>
-        <w:t xml:space="preserve">Ответ: Из школьного конспекта по истории Беларуси, учебника и энциклопедий.</w:t>
+        <w:t xml:space="preserve">Вопрос: Чем заканчивается игра?</w:t>
+      </w:r>
+    </w:p>
+    <w:p>
+      <w:pPr>
+        <w:spacing w:after="120" w:line="300"/>
+      </w:pPr>
+      <w:r>
+        <w:rPr>
+          <w:rFonts w:ascii="Times New Roman" w:cs="Times New Roman" w:eastAsia="Times New Roman" w:hAnsi="Times New Roman"/>
+          <w:sz w:val="28"/>
+          <w:szCs w:val="28"/>
+        </w:rPr>
+        <w:t xml:space="preserve">Ответ: Игра идёт до 2026 года, а в конце подводятся итоги: счёт и звание. Чем лучше развивал страну, тем выше счёт.</w:t>
       </w:r>
     </w:p>
     <w:p>
@@ -1661,20 +1608,20 @@
           <w:sz w:val="28"/>
           <w:szCs w:val="28"/>
         </w:rPr>
-        <w:t xml:space="preserve">Вопрос: Чем заканчивается игра?</w:t>
-      </w:r>
-    </w:p>
-    <w:p>
-      <w:pPr>
-        <w:spacing w:after="120" w:line="300"/>
-      </w:pPr>
-      <w:r>
-        <w:rPr>
-          <w:rFonts w:ascii="Times New Roman" w:cs="Times New Roman" w:eastAsia="Times New Roman" w:hAnsi="Times New Roman"/>
-          <w:sz w:val="28"/>
-          <w:szCs w:val="28"/>
-        </w:rPr>
-        <w:t xml:space="preserve">Ответ: Игра идёт до 2026 года, а в конце подводятся итоги: счёт и звание. Чем лучше развивал страну, тем выше счёт.</w:t>
+        <w:t xml:space="preserve">Вопрос: Чем твоя игра отличается от других?</w:t>
+      </w:r>
+    </w:p>
+    <w:p>
+      <w:pPr>
+        <w:spacing w:after="120" w:line="300"/>
+      </w:pPr>
+      <w:r>
+        <w:rPr>
+          <w:rFonts w:ascii="Times New Roman" w:cs="Times New Roman" w:eastAsia="Times New Roman" w:hAnsi="Times New Roman"/>
+          <w:sz w:val="28"/>
+          <w:szCs w:val="28"/>
+        </w:rPr>
+        <w:t xml:space="preserve">Ответ: Она про Беларусь, на русском языке, работает без интернета, и в ней есть армии на 3D-карте, героини войны и космос.</w:t>
       </w:r>
     </w:p>
     <w:p>
@@ -1690,35 +1637,6 @@
           <w:sz w:val="28"/>
           <w:szCs w:val="28"/>
         </w:rPr>
-        <w:t xml:space="preserve">Вопрос: Чем твоя игра отличается от других?</w:t>
-      </w:r>
-    </w:p>
-    <w:p>
-      <w:pPr>
-        <w:spacing w:after="120" w:line="300"/>
-      </w:pPr>
-      <w:r>
-        <w:rPr>
-          <w:rFonts w:ascii="Times New Roman" w:cs="Times New Roman" w:eastAsia="Times New Roman" w:hAnsi="Times New Roman"/>
-          <w:sz w:val="28"/>
-          <w:szCs w:val="28"/>
-        </w:rPr>
-        <w:t xml:space="preserve">Ответ: Она про Беларусь, на русском языке, работает без интернета, и в ней есть армии на 3D-карте, героини войны и космос.</w:t>
-      </w:r>
-    </w:p>
-    <w:p>
-      <w:pPr>
-        <w:keepNext/>
-        <w:spacing w:after="40" w:before="160"/>
-      </w:pPr>
-      <w:r>
-        <w:rPr>
-          <w:rFonts w:ascii="Times New Roman" w:cs="Times New Roman" w:eastAsia="Times New Roman" w:hAnsi="Times New Roman"/>
-          <w:b/>
-          <w:bCs/>
-          <w:sz w:val="28"/>
-          <w:szCs w:val="28"/>
-        </w:rPr>
         <w:t xml:space="preserve">Вопрос: Что ты хочешь добавить дальше?</w:t>
       </w:r>
     </w:p>
@@ -1732,7 +1650,7 @@
           <w:sz w:val="28"/>
           <w:szCs w:val="28"/>
         </w:rPr>
-        <w:t xml:space="preserve">Ответ: Хочу перевести игру на белорусский язык, выпустить её в App Store и добавить больше событий из истории моего города.</w:t>
+        <w:t xml:space="preserve">Ответ: Хочу перевести игру на белорусский язык и добавить больше событий из истории моего города.</w:t>
       </w:r>
     </w:p>
     <w:p>

</xml_diff>